<commit_message>
docs: update guides v2.1 — workspace path changed to smorch-workspace/
Guides now reflect role-based filtering:
- Workspace path: smorch-workspace/ (not smorch-dist/plugins/)
- Added Step 3: Builds role workspace (role filtering)
- Updated all path references in troubleshooting

Co-Authored-By: Claude Opus 4.6 <noreply@anthropic.com>
</commit_message>
<xml_diff>
--- a/docs/smorch-setup-guide-macos-2026-03.docx
+++ b/docs/smorch-setup-guide-macos-2026-03.docx
@@ -53,7 +53,7 @@
           <w:sz w:val="22"/>
           <w:szCs w:val="22"/>
         </w:rPr>
-        <w:t xml:space="preserve">Version 2.0 — March 2026</w:t>
+        <w:t xml:space="preserve">Version 2.1 — March 2026</w:t>
       </w:r>
     </w:p>
     <w:p>
@@ -1070,25 +1070,25 @@
           <w:sz w:val="24"/>
           <w:szCs w:val="24"/>
         </w:rPr>
-        <w:t xml:space="preserve">Installs Code plugins</w:t>
-      </w:r>
-    </w:p>
-    <w:p>
-      <w:pPr>
-        <w:spacing w:after="120"/>
-      </w:pPr>
-      <w:r>
-        <w:rPr>
-          <w:rFonts w:ascii="Calibri" w:cs="Calibri" w:eastAsia="Calibri" w:hAnsi="Calibri"/>
-          <w:b w:val="false"/>
-          <w:bCs w:val="false"/>
-          <w:i w:val="false"/>
-          <w:iCs w:val="false"/>
-          <w:color w:val="202124"/>
-          <w:sz w:val="22"/>
-          <w:szCs w:val="22"/>
-        </w:rPr>
-        <w:t xml:space="preserve">(Dev/EO roles only) Installs 7 Claude Code development tools: 4 language servers + 3 dev tools.</w:t>
+        <w:t xml:space="preserve">Builds role workspace</w:t>
+      </w:r>
+    </w:p>
+    <w:p>
+      <w:pPr>
+        <w:spacing w:after="120"/>
+      </w:pPr>
+      <w:r>
+        <w:rPr>
+          <w:rFonts w:ascii="Calibri" w:cs="Calibri" w:eastAsia="Calibri" w:hAnsi="Calibri"/>
+          <w:b w:val="false"/>
+          <w:bCs w:val="false"/>
+          <w:i w:val="false"/>
+          <w:iCs w:val="false"/>
+          <w:color w:val="202124"/>
+          <w:sz w:val="22"/>
+          <w:szCs w:val="22"/>
+        </w:rPr>
+        <w:t xml:space="preserve">Creates a smorch-workspace/ folder with ONLY the plugins assigned to your role. Other plugins are not visible.</w:t>
       </w:r>
     </w:p>
     <w:p>
@@ -1115,6 +1115,51 @@
           <w:sz w:val="24"/>
           <w:szCs w:val="24"/>
         </w:rPr>
+        <w:t xml:space="preserve">Installs Code plugins</w:t>
+      </w:r>
+    </w:p>
+    <w:p>
+      <w:pPr>
+        <w:spacing w:after="120"/>
+      </w:pPr>
+      <w:r>
+        <w:rPr>
+          <w:rFonts w:ascii="Calibri" w:cs="Calibri" w:eastAsia="Calibri" w:hAnsi="Calibri"/>
+          <w:b w:val="false"/>
+          <w:bCs w:val="false"/>
+          <w:i w:val="false"/>
+          <w:iCs w:val="false"/>
+          <w:color w:val="202124"/>
+          <w:sz w:val="22"/>
+          <w:szCs w:val="22"/>
+        </w:rPr>
+        <w:t xml:space="preserve">(Dev/EO roles only) Installs 7 Claude Code development tools: 4 language servers + 3 dev tools.</w:t>
+      </w:r>
+    </w:p>
+    <w:p>
+      <w:pPr>
+        <w:spacing w:after="60" w:before="200"/>
+      </w:pPr>
+      <w:r>
+        <w:rPr>
+          <w:rFonts w:ascii="Calibri" w:cs="Calibri" w:eastAsia="Calibri" w:hAnsi="Calibri"/>
+          <w:b/>
+          <w:bCs/>
+          <w:color w:val="1a73e8"/>
+          <w:sz w:val="24"/>
+          <w:szCs w:val="24"/>
+        </w:rPr>
+        <w:t xml:space="preserve">Step 5: </w:t>
+      </w:r>
+      <w:r>
+        <w:rPr>
+          <w:rFonts w:ascii="Calibri" w:cs="Calibri" w:eastAsia="Calibri" w:hAnsi="Calibri"/>
+          <w:b/>
+          <w:bCs/>
+          <w:color w:val="202124"/>
+          <w:sz w:val="24"/>
+          <w:szCs w:val="24"/>
+        </w:rPr>
         <w:t xml:space="preserve">Shows Cowork setup</w:t>
       </w:r>
     </w:p>
@@ -1133,7 +1178,7 @@
           <w:sz w:val="22"/>
           <w:szCs w:val="22"/>
         </w:rPr>
-        <w:t xml:space="preserve">Prints the exact path to paste into Claude Desktop (Cowork) settings.</w:t>
+        <w:t xml:space="preserve">Prints the exact workspace path to paste into Claude Desktop (Cowork) settings.</w:t>
       </w:r>
     </w:p>
     <w:p>
@@ -1337,7 +1382,7 @@
           <w:sz w:val="20"/>
           <w:szCs w:val="20"/>
         </w:rPr>
-        <w:t xml:space="preserve">~/Desktop/cowork-workspace/smorch-dist/plugins</w:t>
+        <w:t xml:space="preserve">~/Desktop/cowork-workspace/smorch-workspace</w:t>
       </w:r>
     </w:p>
     <w:p>
@@ -1873,7 +1918,7 @@
           <w:sz w:val="22"/>
           <w:szCs w:val="22"/>
         </w:rPr>
-        <w:t xml:space="preserve">Verify the workspace path is exactly: ~/Desktop/cowork-workspace/smorch-dist/plugins</w:t>
+        <w:t xml:space="preserve">Verify the workspace path is exactly: ~/Desktop/cowork-workspace/smorch-workspace</w:t>
       </w:r>
     </w:p>
     <w:p>
@@ -1915,7 +1960,7 @@
           <w:sz w:val="22"/>
           <w:szCs w:val="22"/>
         </w:rPr>
-        <w:t xml:space="preserve">Check that the plugins folder exists: ls ~/Desktop/cowork-workspace/smorch-dist/plugins/</w:t>
+        <w:t xml:space="preserve">Check that the workspace folder exists: ls ~/Desktop/cowork-workspace/smorch-workspace/</w:t>
       </w:r>
     </w:p>
     <w:p>

</xml_diff>